<commit_message>
feat(verdicts)!: industry three-tier time-based color code
- Reachable < 1s · Degraded 1-3s · Blocked > 3s or connection failure
  (REACHABLE_MAX_S / BLOCKED_MIN_S env-tunable in the probe script)
- scripts/reclassify.mjs recomputed the derived verdict field across all
  18 archived runs + latest.json from the STORED RAW METRICS (31 changes;
  timings/HTTP codes/curl exits untouched); history.json and timeline.json
  rebuilt; all 36 weekly report artifacts regenerated
- New mix on the latest run: 5 reachable / 3 degraded (Auth0 1.66s,
  Stripe 1.46s, Sentry 1.39s) / 5 blocked
- targets.schema.md documents the tiers and the reclassification note
- Unit 29/29 (tier boundaries, failure precedence, status-code tolerance),
  Playwright 22/22, audit ALL ALIGNED
</commit_message>
<xml_diff>
--- a/results/2026-06-24/report.docx
+++ b/results/2026-06-24/report.docx
@@ -181,7 +181,7 @@
                 <w:sz w:val="20"/>
                 <w:szCs w:val="20"/>
               </w:rPr>
-              <w:t xml:space="preserve">11 — 5 blocked / 1 degraded / 5 reachable</w:t>
+              <w:t xml:space="preserve">11 — 6 blocked / 1 degraded / 4 reachable</w:t>
             </w:r>
           </w:p>
           <w:p>
@@ -923,7 +923,7 @@
                 <w:sz w:val="19"/>
                 <w:szCs w:val="19"/>
               </w:rPr>
-              <w:t xml:space="preserve">Google Sign-In</w:t>
+              <w:t xml:space="preserve">Auth0</w:t>
             </w:r>
           </w:p>
         </w:tc>
@@ -1007,7 +1007,7 @@
                 <w:sz w:val="19"/>
                 <w:szCs w:val="19"/>
               </w:rPr>
-              <w:t xml:space="preserve">accounts.google.com</w:t>
+              <w:t xml:space="preserve">cdn.auth0.com</w:t>
             </w:r>
           </w:p>
         </w:tc>
@@ -1035,7 +1035,7 @@
                 <w:sz w:val="19"/>
                 <w:szCs w:val="19"/>
               </w:rPr>
-              <w:t xml:space="preserve">000</w:t>
+              <w:t xml:space="preserve">200</w:t>
             </w:r>
           </w:p>
         </w:tc>
@@ -1063,7 +1063,7 @@
                 <w:sz w:val="19"/>
                 <w:szCs w:val="19"/>
               </w:rPr>
-              <w:t xml:space="preserve">10.002</w:t>
+              <w:t xml:space="preserve">6.523</w:t>
             </w:r>
           </w:p>
         </w:tc>
@@ -1128,7 +1128,7 @@
                 <w:sz w:val="19"/>
                 <w:szCs w:val="19"/>
               </w:rPr>
-              <w:t xml:space="preserve">YouTube embed</w:t>
+              <w:t xml:space="preserve">Google Sign-In</w:t>
             </w:r>
           </w:p>
         </w:tc>
@@ -1212,7 +1212,7 @@
                 <w:sz w:val="19"/>
                 <w:szCs w:val="19"/>
               </w:rPr>
-              <w:t xml:space="preserve">www.youtube.com</w:t>
+              <w:t xml:space="preserve">accounts.google.com</w:t>
             </w:r>
           </w:p>
         </w:tc>
@@ -1268,7 +1268,7 @@
                 <w:sz w:val="19"/>
                 <w:szCs w:val="19"/>
               </w:rPr>
-              <w:t xml:space="preserve">10.000</w:t>
+              <w:t xml:space="preserve">10.002</w:t>
             </w:r>
           </w:p>
         </w:tc>
@@ -1333,7 +1333,7 @@
                 <w:sz w:val="19"/>
                 <w:szCs w:val="19"/>
               </w:rPr>
-              <w:t xml:space="preserve">Google Maps</w:t>
+              <w:t xml:space="preserve">YouTube embed</w:t>
             </w:r>
           </w:p>
         </w:tc>
@@ -1417,7 +1417,7 @@
                 <w:sz w:val="19"/>
                 <w:szCs w:val="19"/>
               </w:rPr>
-              <w:t xml:space="preserve">maps.googleapis.com</w:t>
+              <w:t xml:space="preserve">www.youtube.com</w:t>
             </w:r>
           </w:p>
         </w:tc>
@@ -1473,7 +1473,7 @@
                 <w:sz w:val="19"/>
                 <w:szCs w:val="19"/>
               </w:rPr>
-              <w:t xml:space="preserve">10.001</w:t>
+              <w:t xml:space="preserve">10.000</w:t>
             </w:r>
           </w:p>
         </w:tc>
@@ -1538,7 +1538,7 @@
                 <w:sz w:val="19"/>
                 <w:szCs w:val="19"/>
               </w:rPr>
-              <w:t xml:space="preserve">Vimeo embed</w:t>
+              <w:t xml:space="preserve">Google Maps</w:t>
             </w:r>
           </w:p>
         </w:tc>
@@ -1622,7 +1622,7 @@
                 <w:sz w:val="19"/>
                 <w:szCs w:val="19"/>
               </w:rPr>
-              <w:t xml:space="preserve">player.vimeo.com</w:t>
+              <w:t xml:space="preserve">maps.googleapis.com</w:t>
             </w:r>
           </w:p>
         </w:tc>
@@ -1678,7 +1678,7 @@
                 <w:sz w:val="19"/>
                 <w:szCs w:val="19"/>
               </w:rPr>
-              <w:t xml:space="preserve">10.002</w:t>
+              <w:t xml:space="preserve">10.001</w:t>
             </w:r>
           </w:p>
         </w:tc>
@@ -1743,7 +1743,7 @@
                 <w:sz w:val="19"/>
                 <w:szCs w:val="19"/>
               </w:rPr>
-              <w:t xml:space="preserve">Auth0</w:t>
+              <w:t xml:space="preserve">Vimeo embed</w:t>
             </w:r>
           </w:p>
         </w:tc>
@@ -1827,7 +1827,7 @@
                 <w:sz w:val="19"/>
                 <w:szCs w:val="19"/>
               </w:rPr>
-              <w:t xml:space="preserve">cdn.auth0.com</w:t>
+              <w:t xml:space="preserve">player.vimeo.com</w:t>
             </w:r>
           </w:p>
         </w:tc>
@@ -1855,7 +1855,7 @@
                 <w:sz w:val="19"/>
                 <w:szCs w:val="19"/>
               </w:rPr>
-              <w:t xml:space="preserve">200</w:t>
+              <w:t xml:space="preserve">000</w:t>
             </w:r>
           </w:p>
         </w:tc>
@@ -1883,7 +1883,7 @@
                 <w:sz w:val="19"/>
                 <w:szCs w:val="19"/>
               </w:rPr>
-              <w:t xml:space="preserve">6.523</w:t>
+              <w:t xml:space="preserve">10.002</w:t>
             </w:r>
           </w:p>
         </w:tc>
@@ -1909,11 +1909,11 @@
               <w:rPr>
                 <w:b/>
                 <w:bCs/>
-                <w:color w:val="B54708"/>
-                <w:sz w:val="19"/>
-                <w:szCs w:val="19"/>
-              </w:rPr>
-              <w:t xml:space="preserve">Degraded</w:t>
+                <w:color w:val="B42318"/>
+                <w:sz w:val="19"/>
+                <w:szCs w:val="19"/>
+              </w:rPr>
+              <w:t xml:space="preserve">Blocked</w:t>
             </w:r>
           </w:p>
         </w:tc>
@@ -1948,7 +1948,7 @@
                 <w:sz w:val="19"/>
                 <w:szCs w:val="19"/>
               </w:rPr>
-              <w:t xml:space="preserve">Google Fonts</w:t>
+              <w:t xml:space="preserve">Adobe Fonts (Typekit)</w:t>
             </w:r>
           </w:p>
         </w:tc>
@@ -2032,7 +2032,7 @@
                 <w:sz w:val="19"/>
                 <w:szCs w:val="19"/>
               </w:rPr>
-              <w:t xml:space="preserve">fonts.googleapis.com</w:t>
+              <w:t xml:space="preserve">use.typekit.net</w:t>
             </w:r>
           </w:p>
         </w:tc>
@@ -2060,7 +2060,7 @@
                 <w:sz w:val="19"/>
                 <w:szCs w:val="19"/>
               </w:rPr>
-              <w:t xml:space="preserve">200</w:t>
+              <w:t xml:space="preserve">404</w:t>
             </w:r>
           </w:p>
         </w:tc>
@@ -2088,7 +2088,7 @@
                 <w:sz w:val="19"/>
                 <w:szCs w:val="19"/>
               </w:rPr>
-              <w:t xml:space="preserve">0.416</w:t>
+              <w:t xml:space="preserve">1.147</w:t>
             </w:r>
           </w:p>
         </w:tc>
@@ -2114,11 +2114,11 @@
               <w:rPr>
                 <w:b/>
                 <w:bCs/>
-                <w:color w:val="067647"/>
-                <w:sz w:val="19"/>
-                <w:szCs w:val="19"/>
-              </w:rPr>
-              <w:t xml:space="preserve">Reachable</w:t>
+                <w:color w:val="B54708"/>
+                <w:sz w:val="19"/>
+                <w:szCs w:val="19"/>
+              </w:rPr>
+              <w:t xml:space="preserve">Degraded</w:t>
             </w:r>
           </w:p>
         </w:tc>
@@ -2153,7 +2153,7 @@
                 <w:sz w:val="19"/>
                 <w:szCs w:val="19"/>
               </w:rPr>
-              <w:t xml:space="preserve">Material Symbols</w:t>
+              <w:t xml:space="preserve">Google Fonts</w:t>
             </w:r>
           </w:p>
         </w:tc>
@@ -2293,7 +2293,7 @@
                 <w:sz w:val="19"/>
                 <w:szCs w:val="19"/>
               </w:rPr>
-              <w:t xml:space="preserve">0.138</w:t>
+              <w:t xml:space="preserve">0.416</w:t>
             </w:r>
           </w:p>
         </w:tc>
@@ -2358,7 +2358,7 @@
                 <w:sz w:val="19"/>
                 <w:szCs w:val="19"/>
               </w:rPr>
-              <w:t xml:space="preserve">Adobe Fonts (Typekit)</w:t>
+              <w:t xml:space="preserve">Material Symbols</w:t>
             </w:r>
           </w:p>
         </w:tc>
@@ -2442,7 +2442,7 @@
                 <w:sz w:val="19"/>
                 <w:szCs w:val="19"/>
               </w:rPr>
-              <w:t xml:space="preserve">use.typekit.net</w:t>
+              <w:t xml:space="preserve">fonts.googleapis.com</w:t>
             </w:r>
           </w:p>
         </w:tc>
@@ -2470,7 +2470,7 @@
                 <w:sz w:val="19"/>
                 <w:szCs w:val="19"/>
               </w:rPr>
-              <w:t xml:space="preserve">404</w:t>
+              <w:t xml:space="preserve">200</w:t>
             </w:r>
           </w:p>
         </w:tc>
@@ -2498,7 +2498,7 @@
                 <w:sz w:val="19"/>
                 <w:szCs w:val="19"/>
               </w:rPr>
-              <w:t xml:space="preserve">1.147</w:t>
+              <w:t xml:space="preserve">0.138</w:t>
             </w:r>
           </w:p>
         </w:tc>
@@ -3232,7 +3232,7 @@
           <w:sz w:val="22"/>
           <w:szCs w:val="22"/>
         </w:rPr>
-        <w:t xml:space="preserve">本期共测 11 项：可达 5、降速 1、阻断 5。</w:t>
+        <w:t xml:space="preserve">本期共测 11 项：可达 4、降速 1、阻断 6。</w:t>
       </w:r>
     </w:p>
     <w:p>

</xml_diff>